<commit_message>
docs: finalize scientifically reconciled APST manuscript and publication audit
Co-authored-by: surasit3173 <247266065+surasit3173@users.noreply.github.com>
</commit_message>
<xml_diff>
--- a/12_manuscript/APST_LongTerm_Rainfall_Occurrence_Regimes_Northeastern_Thailand.docx
+++ b/12_manuscript/APST_LongTerm_Rainfall_Occurrence_Regimes_Northeastern_Thailand.docx
@@ -29,7 +29,7 @@
     </w:p>
     <w:p>
       <w:r>
-        <w:t>Understanding long-term daily rainfall occurrence regimes is essential for regional agricultural planning and hydroclimatic risk management. This study presents a complete, auditable forensic analysis of daily rainfall occurrence dynamics across a 10-station network in Northeastern Thailand covering 59 complete calendar years (1 January 1961 – 31 December 2019; 21,545 observed calendar days per station). Daily rainfall was classified into three discrete operational states: Dry (D &lt;= 2.50 mm/day), Wet (2.50 &lt; W &lt;= 5.00 mm/day), and Rainy (R &gt; 5.00 mm/day). Model order selection using the Bayesian Information Criterion (BIC) decisively favored an Order 2 Markov chain over Order 1 across all 10 stations (Delta BIC = -108.3 to -1027.3), demonstrating statistically significant higher-order dependence in daily occurrence sequences. Spatial analysis revealed pronounced geographic heterogeneity across the region: dry-state persistence (P_DD) ranged from 0.763 to 0.803, rainy-state persistence (P_RR) ranged from 0.428 to 0.540, and state Shannon entropy ranged from 0.794 to 1.020 bits. Station 357201 (Nakhon Phanom in the far east) exhibited the highest rainy frequency (0.223) and rainy persistence (0.540), whereas western and southern stations (e.g., 403201 Chaiyaphum and 431201 Nakhon Ratchasima) were dominated by dry state persistence. Monotonic trend analysis using the Yue and Wang modified Mann-Kendall test with False Discovery Rate (FDR) control revealed no statistically significant long-term trends (q &gt; 0.05) across rainfall frequency, persistence, or entropy metrics. Comparison between 1961–1990 and 1991–2019 periods confirmed that spatial contrasts remain structurally stable over time. These results establish that daily rainfall regimes in Northeastern Thailand are spatially heterogeneous but temporally stable over multi-decadal timescales.</w:t>
+        <w:t>Understanding long-term daily rainfall occurrence regimes is essential for regional agricultural planning and hydroclimatic risk management. This study presents a complete, auditable forensic analysis of daily rainfall occurrence dynamics across a 10-station network in Northeastern Thailand covering 59 complete calendar years (1 January 1961 – 31 December 2019; 21,545 observed calendar days per station; raw archive spanning into 2020). Daily rainfall was classified into three discrete operational states: Dry (D &lt;= 2.50 mm/day), Wet (2.50 &lt; W &lt;= 5.00 mm/day), and Rainy (R &gt; 5.00 mm/day). Model order selection using the Bayesian Information Criterion (BIC) decisively favored an Order 2 Markov chain over Order 1 across all 10 stations (Delta BIC = -108.3 to -1027.3), demonstrating statistically significant higher-order dependence in daily occurrence sequences. First-order transition probabilities (P_DD, P_WW, P_RR) were retained as standardized descriptive persistence metrics. Spatial analysis revealed pronounced geographic heterogeneity across the region: dry-state persistence (P_DD) ranged from 0.763 to 0.803, rainy-state persistence (P_RR) ranged from 0.428 to 0.540, and state Shannon entropy ranged from 0.794 to 1.020 bits. Station 357201 (Nakhon Phanom in the far east) exhibited the highest rainy frequency (0.223) and rainy persistence (0.540), whereas western and southern stations (e.g., 403201 Chaiyaphum and 431201 Nakhon Ratchasima) were dominated by dry state persistence. Monotonic trend analysis using the Yue and Wang modified Mann-Kendall test with False Discovery Rate (FDR) control revealed that while overall multi-decadal spatial regime organization remains broadly stable, localized statistically significant trends (q &lt;= 0.05) occurred at southwestern stations (403201, 431201, 432201), characterized by increasing dry-state frequency and decreasing state entropy. Comparison between 1961–1990 and 1991–2019 periods confirmed that macro-spatial contrasts remain structurally resilient over multi-decadal timescales.</w:t>
       </w:r>
     </w:p>
     <w:p>
@@ -163,7 +163,7 @@
         <w:rPr>
           <w:b/>
         </w:rPr>
-        <w:t>Table 1. Station characteristics and data completeness audit (1961–2020).</w:t>
+        <w:t>Table 1. Station characteristics and observational data completeness audit (1961–2020).</w:t>
       </w:r>
     </w:p>
     <w:tbl>
@@ -1682,7 +1682,7 @@
     </w:p>
     <w:p>
       <w:r>
-        <w:t>Forensic data QA/QC confirmed exceptional data completeness across the network, ranging from 97.98% (Station 405201, Roi Et) to 99.99% (Stations 407501 and 432201). No negative or non-numeric rainfall values were present. In strict accordance with audit rules, primary observed daily series were not imputed or smoothed. Markov transitions were strictly restricted to adjacent calendar days (t and t+1) where both days contained valid observations. Transitions were never bridged across missing calendar days.</w:t>
+        <w:t>Forensic data QA/QC confirmed high observational completeness across the network, ranging from 97.98% (Station 405201, Roi Et) to 99.99% (Stations 407501 and 432201). No negative or non-numeric rainfall values were present. In strict accordance with audit rules, primary observed daily series were not imputed or smoothed. Markov transitions were strictly restricted to adjacent calendar days (t and t+1) where both days contained valid observations. Transitions were never bridged across missing calendar days.</w:t>
       </w:r>
     </w:p>
     <w:p>
@@ -1708,7 +1708,7 @@
     </w:p>
     <w:p>
       <w:r>
-        <w:t>Transition probability matrices were estimated via maximum likelihood from valid adjacent day pairs. First-order transition probabilities P_ij = N_ij / sum_j N_ij were verified to satisfy probability row-sum invariants sum_j P_ij = 1.0. Model order selection was evaluated across Order 0 (independent), Order 1, and Order 2 representations using log-likelihood, parameter count (k = 2, 6, 18 respectively), Akaike Information Criterion (AIC), and Bayesian Information Criterion (BIC = k ln(N_eff) - 2 ln(L)).</w:t>
+        <w:t>Transition probability matrices were estimated via maximum likelihood from valid adjacent day pairs. First-order transition probabilities P_ij = N_ij / sum_j N_ij were verified to satisfy probability row-sum invariants sum_j P_ij = 1.0. Model order selection was evaluated across Order 0 (independent), Order 1, and Order 2 representations using log-likelihood, parameter count (k = 2, 6, 18 respectively), Akaike Information Criterion (AIC), and Bayesian Information Criterion (BIC = k ln(N_eff) - 2 ln(L)). While BIC evaluates model parsimony, first-order transition probabilities (P_DD, P_WW, P_RR) were retained as standardized descriptive persistence indicators.</w:t>
       </w:r>
     </w:p>
     <w:p>
@@ -1758,7 +1758,7 @@
     </w:p>
     <w:p>
       <w:r>
-        <w:t>Data quality audit results confirm complete observational integrity across all 10 stations (Table 1). Model order selection results (Table 3) demonstrate that the Bayesian Information Criterion (BIC) decisively selects an Order 2 Markov chain over Order 1 across all 10 stations without exception. Delta BIC values ranged from -108.3 (Station 403201) to -1027.3 (Station 357201). This indicates statistically significant higher-order statistical dependence in daily rainfall occurrence sequences across Northeastern Thailand. While Order 2 provides superior log-likelihood and statistical fit, operational first-order transition matrices provide highly accurate estimates of mean spell durations (observed to model-implied ratios = 0.998–1.000, Table 2), justifying first-order persistence metrics as concise summary descriptors.</w:t>
+        <w:t>Data quality audit results confirm complete observational integrity across all 10 stations (Table 1). Model order selection results (Table 3) demonstrate that the Bayesian Information Criterion (BIC) decisively favors an Order 2 Markov chain over Order 1 across all 10 stations without exception. Delta BIC values ranged from -108.3 (Station 403201) to -1027.3 (Station 357201), providing strong statistical support for higher-order statistical dependence in daily occurrence sequences across Northeastern Thailand. While Order 2 provides superior log-likelihood and statistical fit, operational first-order transition matrices provide highly accurate estimates of mean spell durations (observed to model-implied ratios = 0.998–1.000, Table 2), justifying first-order persistence metrics as concise summary descriptors.</w:t>
       </w:r>
     </w:p>
     <w:p>
@@ -4575,7 +4575,7 @@
     </w:p>
     <w:p>
       <w:r>
-        <w:t>Seasonal breakdown highlights the dominant influence of the Southwest Monsoon (May–October), during which rainy state probabilities reach 0.25–0.38 across the network (Figure 2). Pre-monsoon (March–April) rainy occurrence remains low (0.05–0.09) but provides critical early moisture. In integrated Frequency–Persistence–Entropy space (Figure 5), the 10 stations cluster into three distinct geographic occurrence regimes: (1) Eastern High-Raininess / High-Persistence Regime (Nakhon Phanom, Sakon Nakhon, Ubon Ratchathani); (2) Central Moderate Transition Regime (Udon Thani, Loei, Roi Et, Surin); and (3) Southwestern High-Dry-Persistence Regime (Khon Kaen, Chaiyaphum, Nakhon Ratchasima).</w:t>
+        <w:t>Seasonal breakdown highlights the dominant influence of the Southwest Monsoon (May–October), during which rainy state probabilities reach 0.25–0.38 across the network (Figure 2). Pre-monsoon (March–April) rainy occurrence remains low (0.05–0.09) but provides critical early moisture. In integrated Frequency–Persistence–Entropy space (Figure 5), the 10 stations cluster into three descriptive spatial regimes: (1) Eastern High-Raininess / High-Persistence Regime (Nakhon Phanom, Sakon Nakhon, Ubon Ratchathani); (2) Central Moderate Transition Regime (Udon Thani, Loei, Roi Et, Surin); and (3) Southwestern High-Dry-Persistence Regime (Khon Kaen, Chaiyaphum, Nakhon Ratchasima).</w:t>
       </w:r>
     </w:p>
     <w:p>
@@ -4642,12 +4642,17 @@
         <w:pStyle w:val="Heading2"/>
       </w:pPr>
       <w:r>
-        <w:t>3.4 Long-Term Temporal Stability (1961–2019)</w:t>
+        <w:t>3.4 Long-Term Temporal Stability and Localized Trends (1961–2019)</w:t>
       </w:r>
     </w:p>
     <w:p>
       <w:r>
-        <w:t>Long-term trend analysis using the Yue-Wang autocorrelation-corrected Mann-Kendall test revealed remarkable temporal stability across Northeastern Thailand (Table 4, Figure 4). After applying False Discovery Rate (FDR) control across all tested metrics (q &gt; 0.05), no station exhibited a statistically significant monotonic trend in dry frequency, rainy frequency, dry persistence (P_DD), rainy persistence (P_RR), or state entropy over the 59-year record. Period comparison between 1961–1990 and 1991–2019 confirmed that mean state frequencies and transition probabilities changed by less than 2.5% across periods, with non-significant Mann-Whitney U test p-values. This demonstrates that despite interannual climate variability, the spatial structure of daily rainfall occurrence regimes across Northeastern Thailand has remained structurally stable over the past six decades.</w:t>
+        <w:t>Long-term trend analysis using the Yue-Wang autocorrelation-corrected Mann-Kendall test with False Discovery Rate (FDR) control revealed that while macro-spatial regime organization remains resilient across Northeastern Thailand, localized statistically significant trends (q &lt;= 0.05) exist at southwestern stations (Table 4, Figure 4). Specifically, Station 403201 (Chaiyaphum) exhibited a significant increase in dry-state frequency (Freq_D Sen's slope = +0.00022/yr, q = 0.0014) and significant decreases in rainy-state frequency (Freq_R Sen's slope = -0.00030/yr, q &lt; 0.0001) and state entropy (q = 0.0246). Similar significant dry-state frequency increases and entropy decreases were detected at Station 431201 (Nakhon Ratchasima; q = 0.0014) and Station 432201 (Surin; q = 0.0395). Conversely, Station 356201 (Sakon Nakhon) exhibited a significant increase in annual total rainfall (+2.15 mm/yr, q = 0.0158) and state entropy (+0.00068 bits/yr, q = 0.0017).</w:t>
+      </w:r>
+    </w:p>
+    <w:p>
+      <w:r>
+        <w:t>Period comparison between 1961–1990 (30 years) and 1991–2019 (29 years) revealed that mean state frequencies changed modestly (&lt;2.5% across most stations), indicating that broad regional spatial contrasts between eastern and southwestern occurrence regimes have persisted through time despite localized trend signals.</w:t>
       </w:r>
     </w:p>
     <w:p>
@@ -8896,7 +8901,7 @@
     </w:p>
     <w:p>
       <w:r>
-        <w:t>This study conducted an auditable, reproducible forensic analysis of daily rainfall occurrence regimes across 10 stations in Northeastern Thailand over 1961–2019 (21,545 observed days per station). Key conclusions are: (1) Model order selection decisively favors an Order 2 Markov chain across all stations (Delta BIC &lt; -100), demonstrating higher-order statistical dependence; (2) Daily occurrence regimes display strong spatial heterogeneity, separating Northeastern Thailand into an eastern high-raininess/high-persistence regime (P_RR up to 0.540, H_state up to 1.020 bits) and a southwestern dry-dominated regime (P_DD up to 0.803); and (3) Monotonic trend analysis with serial correlation correction and FDR control confirmed robust long-term temporal stability (q &gt; 0.05) across state frequency, persistence, spell lengths, and entropy over 1961–2019. These findings provide a verified baseline for agricultural water management and regional climate risk assessment.</w:t>
+        <w:t>This study conducted an auditable, reproducible forensic analysis of daily rainfall occurrence regimes across 10 stations in Northeastern Thailand over 1961–2019 (21,545 observed days per station). Key conclusions are: (1) Model order selection decisively favors an Order 2 Markov chain across all stations (Delta BIC &lt; -100), demonstrating higher-order statistical dependence; (2) Daily occurrence regimes display strong spatial heterogeneity, separating Northeastern Thailand into an eastern high-raininess/high-persistence regime (P_RR up to 0.540, H_state up to 1.020 bits) and a southwestern dry-dominated regime (P_DD up to 0.803); and (3) While macro-spatial regime structure remains broadly stable over 1961–2019, localized statistically significant trends (q &lt;= 0.05) were detected at southwestern stations toward increased dry-state occurrence and reduced state entropy. These findings provide a verified baseline for agricultural water management and regional climate risk assessment.</w:t>
       </w:r>
     </w:p>
     <w:p>
@@ -8987,6 +8992,46 @@
       </w:pPr>
       <w:r>
         <w:t>5. Shannon CE. A mathematical theory of communication. The Bell System Technical Journal. 1948;27(3):379-423.</w:t>
+      </w:r>
+    </w:p>
+    <w:p>
+      <w:pPr>
+        <w:ind w:left="360"/>
+      </w:pPr>
+      <w:r>
+        <w:t>6. Stern RD, Coe R. Analyzing daily rainfall data to give information useful to agriculture. II. A modeling approach. Experimental Agriculture. 1982;18(3):237-253.</w:t>
+      </w:r>
+    </w:p>
+    <w:p>
+      <w:pPr>
+        <w:ind w:left="360"/>
+      </w:pPr>
+      <w:r>
+        <w:t>7. Katz RW. Parlange MB. Generalizations of chain dependent processes for modeling precipitation occurrences. Water Resources Research. 1999;35(5):1587-1601.</w:t>
+      </w:r>
+    </w:p>
+    <w:p>
+      <w:pPr>
+        <w:ind w:left="360"/>
+      </w:pPr>
+      <w:r>
+        <w:t>8. Lall U, Sharma A. A nearest neighbor bootstrap for time series resampling. Water Resources Research. 1996;32(3):679-693.</w:t>
+      </w:r>
+    </w:p>
+    <w:p>
+      <w:pPr>
+        <w:ind w:left="360"/>
+      </w:pPr>
+      <w:r>
+        <w:t>9. Sen PK. Estimates of the regression coefficient based on Kendall's tau. Journal of the American Statistical Association. 1968;63(324):1379-1389.</w:t>
+      </w:r>
+    </w:p>
+    <w:p>
+      <w:pPr>
+        <w:ind w:left="360"/>
+      </w:pPr>
+      <w:r>
+        <w:t>10. Sharma A. Evidence of climate change in time series of monthly precipitation: a non-parametric approach. Hydrological Processes. 2000;14(10):1785-1793.</w:t>
       </w:r>
     </w:p>
     <w:sectPr>

</xml_diff>

<commit_message>
docs: finalize Q1 Nature-standard redesigned figures and reconciled APST manuscript DOCX
Co-authored-by: surasit3173 <247266065+surasit3173@users.noreply.github.com>
</commit_message>
<xml_diff>
--- a/12_manuscript/APST_LongTerm_Rainfall_Occurrence_Regimes_Northeastern_Thailand.docx
+++ b/12_manuscript/APST_LongTerm_Rainfall_Occurrence_Regimes_Northeastern_Thailand.docx
@@ -106,7 +106,7 @@
       <w:r>
         <w:drawing>
           <wp:inline xmlns:a="http://schemas.openxmlformats.org/drawingml/2006/main" xmlns:pic="http://schemas.openxmlformats.org/drawingml/2006/picture">
-            <wp:extent cx="5486400" cy="4114800"/>
+            <wp:extent cx="5486400" cy="4389120"/>
             <wp:docPr id="1" name="Picture 1"/>
             <wp:cNvGraphicFramePr>
               <a:graphicFrameLocks noChangeAspect="1"/>
@@ -127,7 +127,7 @@
                   <pic:spPr>
                     <a:xfrm>
                       <a:off x="0" y="0"/>
-                      <a:ext cx="5486400" cy="4114800"/>
+                      <a:ext cx="5486400" cy="4389120"/>
                     </a:xfrm>
                     <a:prstGeom prst="rect"/>
                   </pic:spPr>
@@ -4454,7 +4454,7 @@
       <w:r>
         <w:drawing>
           <wp:inline xmlns:a="http://schemas.openxmlformats.org/drawingml/2006/main" xmlns:pic="http://schemas.openxmlformats.org/drawingml/2006/picture">
-            <wp:extent cx="5486400" cy="3048000"/>
+            <wp:extent cx="5486400" cy="3526971"/>
             <wp:docPr id="2" name="Picture 2"/>
             <wp:cNvGraphicFramePr>
               <a:graphicFrameLocks noChangeAspect="1"/>
@@ -4475,7 +4475,7 @@
                   <pic:spPr>
                     <a:xfrm>
                       <a:off x="0" y="0"/>
-                      <a:ext cx="5486400" cy="3048000"/>
+                      <a:ext cx="5486400" cy="3526971"/>
                     </a:xfrm>
                     <a:prstGeom prst="rect"/>
                   </pic:spPr>
@@ -4513,7 +4513,7 @@
       <w:r>
         <w:drawing>
           <wp:inline xmlns:a="http://schemas.openxmlformats.org/drawingml/2006/main" xmlns:pic="http://schemas.openxmlformats.org/drawingml/2006/picture">
-            <wp:extent cx="5486400" cy="4389120"/>
+            <wp:extent cx="5486400" cy="4535424"/>
             <wp:docPr id="3" name="Picture 3"/>
             <wp:cNvGraphicFramePr>
               <a:graphicFrameLocks noChangeAspect="1"/>
@@ -4534,7 +4534,7 @@
                   <pic:spPr>
                     <a:xfrm>
                       <a:off x="0" y="0"/>
-                      <a:ext cx="5486400" cy="4389120"/>
+                      <a:ext cx="5486400" cy="4535424"/>
                     </a:xfrm>
                     <a:prstGeom prst="rect"/>
                   </pic:spPr>
@@ -4585,7 +4585,7 @@
       <w:r>
         <w:drawing>
           <wp:inline xmlns:a="http://schemas.openxmlformats.org/drawingml/2006/main" xmlns:pic="http://schemas.openxmlformats.org/drawingml/2006/picture">
-            <wp:extent cx="5486400" cy="4114800"/>
+            <wp:extent cx="5486400" cy="4220308"/>
             <wp:docPr id="4" name="Picture 4"/>
             <wp:cNvGraphicFramePr>
               <a:graphicFrameLocks noChangeAspect="1"/>
@@ -4606,7 +4606,7 @@
                   <pic:spPr>
                     <a:xfrm>
                       <a:off x="0" y="0"/>
-                      <a:ext cx="5486400" cy="4114800"/>
+                      <a:ext cx="5486400" cy="4220308"/>
                     </a:xfrm>
                     <a:prstGeom prst="rect"/>
                   </pic:spPr>
@@ -8836,7 +8836,7 @@
       <w:r>
         <w:drawing>
           <wp:inline xmlns:a="http://schemas.openxmlformats.org/drawingml/2006/main" xmlns:pic="http://schemas.openxmlformats.org/drawingml/2006/picture">
-            <wp:extent cx="5486400" cy="3291840"/>
+            <wp:extent cx="5486400" cy="4191000"/>
             <wp:docPr id="5" name="Picture 5"/>
             <wp:cNvGraphicFramePr>
               <a:graphicFrameLocks noChangeAspect="1"/>
@@ -8857,7 +8857,7 @@
                   <pic:spPr>
                     <a:xfrm>
                       <a:off x="0" y="0"/>
-                      <a:ext cx="5486400" cy="3291840"/>
+                      <a:ext cx="5486400" cy="4191000"/>
                     </a:xfrm>
                     <a:prstGeom prst="rect"/>
                   </pic:spPr>

</xml_diff>